<commit_message>
docs(td-001): §10 development methodology & QA chapter + root cleanup
- 新 §10 开发方法与质量保障(原 10/11 顺延为 11/12,锚点/TOC/交叉引用程序化校验
  零断链):图 9 多代理工作流(协调者 verify-then-dispatch → Fable/Opus/Sonnet 按
  安全关键度分批 → 独立评审带(上下文隔离,两轮制)→ 验证门/收口);表 13 技能与
  代理体系 17 行;图 10 规格驱动七站流水线(盲区→访谈→规格→TDD→验证→对抗审查→收口,
  偏离记录制度);「评审拦截实录」四例(LOPA 造假/IE-FT 6 项/R2 隔离层 9 项/R5 F1)
  成文为坚持独立评审的依据——本章即 SQA 说明,答工具本身的开发质量之问。
- Word 版同步重建(10 图/13 表/12 章,1.3MB,结构自检通过);Artifact 同 URL 更新。
- 根目录收尾:run.ps1 归档 docs/archive/(CLAUDE.md 指引更新);清除 07-08 误生成的
  根级 node_modules/.vite 缓存。根目录 tracked 文件仅余 6 个配置/文档,评估结论:
  结构已洁,无需进一步重组(examples/ 为合法样例,缓存/产物均已 gitignore)。

Co-Authored-By: Claude Fable 5 <noreply@anthropic.com>
</commit_message>
<xml_diff>
--- a/docs/BESS-PSA-TD-001-技术文档.docx
+++ b/docs/BESS-PSA-TD-001-技术文档.docx
@@ -6627,7 +6627,7 @@
               <w:br/>
               <w:t xml:space="preserve">  组合总览据此比较的是"各项目最近钉扎场景",非项目全部 ETA 之和——页脚已披露;</w:t>
               <w:br/>
-              <w:t xml:space="preserve">  按勾选集合并导出的"聚合范围钉扎"列于路线图(§10)。</w:t>
+              <w:t xml:space="preserve">  按勾选集合并导出的"聚合范围钉扎"列于路线图(§11)。</w:t>
             </w:r>
           </w:p>
         </w:tc>
@@ -12388,7 +12388,7 @@
         <w:br/>
         <w:t xml:space="preserve">  (画布、版本库、报告、领域数据)并以其为基准语料持续对拍。诚实边界:核级 Level-2/火灾/地震 PSA 的</w:t>
         <w:br/>
-        <w:t xml:space="preserve">  专用模块、数十年监管认可积累,均是商用工具的护城河,本工具不声称覆盖(§10)。</w:t>
+        <w:t xml:space="preserve">  专用模块、数十年监管认可积累,均是商用工具的护城河,本工具不声称覆盖(§11)。</w:t>
       </w:r>
     </w:p>
     <w:p>
@@ -12396,7 +12396,1082 @@
         <w:pStyle w:val="Heading1"/>
       </w:pPr>
       <w:r>
-        <w:t>10 局限与路线图</w:t>
+        <w:t>10 开发方法与质量保障</w:t>
+      </w:r>
+    </w:p>
+    <w:p>
+      <w:r>
+        <w:t>安全工具的可信度不止于算法正确,还取决于</w:t>
+      </w:r>
+      <w:r>
+        <w:rPr>
+          <w:b/>
+        </w:rPr>
+        <w:t>它是怎么被构建与验证的</w:t>
+      </w:r>
+      <w:r>
+        <w:rPr/>
+        <w:t>。</w:t>
+        <w:br/>
+        <w:t xml:space="preserve">  本工具采用"多代理分工 + 独立对抗评审 + 规格驱动"的工程方法:模型按任务的安全关键度分派,</w:t>
+        <w:br/>
+        <w:t xml:space="preserve">  评审者与实现者上下文隔离,每个特性带着规格、验证记录与偏离日志进入主干。本章即软件质量保障</w:t>
+        <w:br/>
+        <w:t xml:space="preserve">  (SQA)说明——监管评审询问"工具本身的开发质量"时,以本章与仓库内证据回答。</w:t>
+      </w:r>
+    </w:p>
+    <w:p>
+      <w:pPr>
+        <w:pStyle w:val="Heading2"/>
+      </w:pPr>
+      <w:r>
+        <w:t>10.1 多代理工作流</w:t>
+      </w:r>
+    </w:p>
+    <w:p>
+      <w:pPr>
+        <w:jc w:val="center"/>
+      </w:pPr>
+      <w:r>
+        <w:drawing>
+          <wp:inline xmlns:a="http://schemas.openxmlformats.org/drawingml/2006/main" xmlns:pic="http://schemas.openxmlformats.org/drawingml/2006/picture">
+            <wp:extent cx="5976000" cy="2716364"/>
+            <wp:docPr id="9" name="Picture 9"/>
+            <wp:cNvGraphicFramePr>
+              <a:graphicFrameLocks noChangeAspect="1"/>
+            </wp:cNvGraphicFramePr>
+            <a:graphic>
+              <a:graphicData uri="http://schemas.openxmlformats.org/drawingml/2006/picture">
+                <pic:pic>
+                  <pic:nvPicPr>
+                    <pic:cNvPr id="0" name="fig-9.png"/>
+                    <pic:cNvPicPr/>
+                  </pic:nvPicPr>
+                  <pic:blipFill>
+                    <a:blip r:embed="rId17"/>
+                    <a:stretch>
+                      <a:fillRect/>
+                    </a:stretch>
+                  </pic:blipFill>
+                  <pic:spPr>
+                    <a:xfrm>
+                      <a:off x="0" y="0"/>
+                      <a:ext cx="5976000" cy="2716364"/>
+                    </a:xfrm>
+                    <a:prstGeom prst="rect"/>
+                  </pic:spPr>
+                </pic:pic>
+              </a:graphicData>
+            </a:graphic>
+          </wp:inline>
+        </w:drawing>
+      </w:r>
+    </w:p>
+    <w:p>
+      <w:pPr>
+        <w:jc w:val="left"/>
+      </w:pPr>
+      <w:r>
+        <w:rPr>
+          <w:b/>
+          <w:color w:val="66788C"/>
+          <w:sz w:val="18"/>
+        </w:rPr>
+        <w:t>图 9</w:t>
+      </w:r>
+      <w:r>
+        <w:rPr>
+          <w:color w:val="66788C"/>
+          <w:sz w:val="18"/>
+        </w:rPr>
+        <w:t xml:space="preserve"> · 多代理工作流。要点:实现者与评审者</w:t>
+      </w:r>
+      <w:r>
+        <w:rPr>
+          <w:b/>
+          <w:color w:val="66788C"/>
+          <w:sz w:val="18"/>
+        </w:rPr>
+        <w:t>上下文隔离</w:t>
+      </w:r>
+      <w:r>
+        <w:rPr>
+          <w:color w:val="66788C"/>
+          <w:sz w:val="18"/>
+        </w:rPr>
+        <w:br/>
+        <w:t xml:space="preserve">    (评审代理冷读代码,不继承实现叙事);协调者逐批独立验收(门禁 + 浏览器实测)后才派下一批;</w:t>
+        <w:br/>
+        <w:t xml:space="preserve">    子代理后台运行,进程中断可原地续跑。模型分派策略详见 </w:t>
+      </w:r>
+      <w:r>
+        <w:rPr>
+          <w:rFonts w:ascii="Consolas" w:hAnsi="Consolas"/>
+          <w:color w:val="66788C"/>
+          <w:sz w:val="18"/>
+        </w:rPr>
+        <w:t>docs/design/ai-model-strategy.md</w:t>
+      </w:r>
+      <w:r>
+        <w:rPr>
+          <w:color w:val="66788C"/>
+          <w:sz w:val="18"/>
+        </w:rPr>
+        <w:t>。</w:t>
+      </w:r>
+    </w:p>
+    <w:tbl>
+      <w:tblPr>
+        <w:tblStyle w:val="TableGrid"/>
+        <w:tblW w:type="auto" w:w="0"/>
+        <w:tblLook w:firstColumn="1" w:firstRow="1" w:lastColumn="0" w:lastRow="0" w:noHBand="0" w:noVBand="1" w:val="04A0"/>
+      </w:tblPr>
+      <w:tblGrid>
+        <w:gridCol w:w="9972"/>
+      </w:tblGrid>
+      <w:tr>
+        <w:tc>
+          <w:tcPr>
+            <w:tcW w:type="dxa" w:w="9972"/>
+            <w:shd w:val="clear" w:fill="EAF0FD"/>
+          </w:tcPr>
+          <w:p>
+            <w:r>
+              <w:rPr>
+                <w:b/>
+                <w:sz w:val="19"/>
+              </w:rPr>
+              <w:t>评审拦截实录(为什么坚持独立评审)。</w:t>
+            </w:r>
+            <w:r>
+              <w:rPr>
+                <w:sz w:val="19"/>
+              </w:rPr>
+              <w:t>同作者的测试会遗传同作者的盲区</w:t>
+              <w:br/>
+              <w:t xml:space="preserve">  ——本项目四次实证:①模板迁移时 LLM 曾</w:t>
+            </w:r>
+            <w:r>
+              <w:rPr>
+                <w:b/>
+                <w:sz w:val="19"/>
+              </w:rPr>
+              <w:t>凭空发明</w:t>
+            </w:r>
+            <w:r>
+              <w:rPr>
+                <w:sz w:val="19"/>
+              </w:rPr>
+              <w:t>第四道屏障并改 PFD,自写测试</w:t>
+              <w:br/>
+              <w:t xml:space="preserve">  全绿,domain-reviewer 抓获(逐字还原 + 护栏测试);②初因频率通道 round-1 六项发现,含 UI</w:t>
+              <w:br/>
+              <w:t xml:space="preserve">  可达的非相干门静默错数 +67%;③多项目隔离层 8 条自测锁全绿,冷读对抗审查 40 分钟判 FAIL</w:t>
+              <w:br/>
+              <w:t xml:space="preserve">  (9 项,2 项 CRITICAL 跨项目存档覆盖,全部探针证实后修复);④组合总览夹具伪造数据形状,</w:t>
+              <w:br/>
+              <w:t xml:space="preserve">  遮蔽"真实不确定性运行显示为未量化"的反保守缺陷。由此立规:</w:t>
+            </w:r>
+            <w:r>
+              <w:rPr>
+                <w:b/>
+                <w:sz w:val="19"/>
+              </w:rPr>
+              <w:t>隔离/状态机/并发类改动,</w:t>
+              <w:br/>
+              <w:t xml:space="preserve">  套件全绿仍必须冷读对抗审查</w:t>
+            </w:r>
+            <w:r>
+              <w:rPr>
+                <w:sz w:val="19"/>
+              </w:rPr>
+              <w:t>(verify-psa 升级规则)。</w:t>
+            </w:r>
+          </w:p>
+        </w:tc>
+      </w:tr>
+    </w:tbl>
+    <w:p>
+      <w:pPr>
+        <w:spacing w:after="0"/>
+      </w:pPr>
+    </w:p>
+    <w:p>
+      <w:pPr>
+        <w:pStyle w:val="Heading2"/>
+      </w:pPr>
+      <w:r>
+        <w:t>10.2 技能与代理体系</w:t>
+      </w:r>
+    </w:p>
+    <w:p>
+      <w:r>
+        <w:t>项目知识以</w:t>
+      </w:r>
+      <w:r>
+        <w:rPr>
+          <w:b/>
+        </w:rPr>
+        <w:t>技能文件</w:t>
+      </w:r>
+      <w:r>
+        <w:rPr/>
+        <w:t>沉淀(</w:t>
+      </w:r>
+      <w:r>
+        <w:rPr>
+          <w:rFonts w:ascii="Consolas" w:hAnsi="Consolas"/>
+          <w:sz w:val="19"/>
+        </w:rPr>
+        <w:t>.claude/skills/</w:t>
+      </w:r>
+      <w:r>
+        <w:rPr/>
+        <w:t>,5 域 + 9 流程),</w:t>
+        <w:br/>
+        <w:t xml:space="preserve">  代理开工前按触发词加载对应技能——架构地图、硬性规则、已付学费的陷阱因此跨会话、跨代理继承,</w:t>
+        <w:br/>
+        <w:t xml:space="preserve">  而不是留在某次对话里:</w:t>
+      </w:r>
+    </w:p>
+    <w:p>
+      <w:pPr>
+        <w:spacing w:before="160"/>
+      </w:pPr>
+      <w:r>
+        <w:rPr>
+          <w:b/>
+          <w:color w:val="66788C"/>
+          <w:sz w:val="18"/>
+        </w:rPr>
+        <w:t>表 13</w:t>
+      </w:r>
+      <w:r>
+        <w:rPr>
+          <w:color w:val="66788C"/>
+          <w:sz w:val="18"/>
+        </w:rPr>
+        <w:t xml:space="preserve"> · 技能与代理清单(每项一句话;完整内容见 </w:t>
+      </w:r>
+      <w:r>
+        <w:rPr>
+          <w:rFonts w:ascii="Consolas" w:hAnsi="Consolas"/>
+          <w:color w:val="66788C"/>
+          <w:sz w:val="18"/>
+        </w:rPr>
+        <w:t>.claude/skills/*/SKILL.md</w:t>
+      </w:r>
+      <w:r>
+        <w:rPr>
+          <w:color w:val="66788C"/>
+          <w:sz w:val="18"/>
+        </w:rPr>
+        <w:t>)</w:t>
+      </w:r>
+    </w:p>
+    <w:tbl>
+      <w:tblPr>
+        <w:tblStyle w:val="TableGrid"/>
+        <w:tblW w:type="auto" w:w="0"/>
+        <w:jc w:val="center"/>
+        <w:tblLook w:firstColumn="1" w:firstRow="1" w:lastColumn="0" w:lastRow="0" w:noHBand="0" w:noVBand="1" w:val="04A0"/>
+      </w:tblPr>
+      <w:tblGrid>
+        <w:gridCol w:w="3324"/>
+        <w:gridCol w:w="3324"/>
+        <w:gridCol w:w="3324"/>
+      </w:tblGrid>
+      <w:tr>
+        <w:tc>
+          <w:tcPr>
+            <w:tcW w:type="dxa" w:w="3324"/>
+            <w:shd w:val="clear" w:fill="E8EDF5"/>
+          </w:tcPr>
+          <w:p>
+            <w:r>
+              <w:rPr>
+                <w:b/>
+                <w:sz w:val="17"/>
+              </w:rPr>
+              <w:t>类别</w:t>
+            </w:r>
+          </w:p>
+        </w:tc>
+        <w:tc>
+          <w:tcPr>
+            <w:tcW w:type="dxa" w:w="3324"/>
+            <w:shd w:val="clear" w:fill="E8EDF5"/>
+          </w:tcPr>
+          <w:p>
+            <w:r>
+              <w:rPr>
+                <w:b/>
+                <w:sz w:val="17"/>
+              </w:rPr>
+              <w:t>名称</w:t>
+            </w:r>
+          </w:p>
+        </w:tc>
+        <w:tc>
+          <w:tcPr>
+            <w:tcW w:type="dxa" w:w="3324"/>
+            <w:shd w:val="clear" w:fill="E8EDF5"/>
+          </w:tcPr>
+          <w:p>
+            <w:r>
+              <w:rPr>
+                <w:b/>
+                <w:sz w:val="17"/>
+              </w:rPr>
+              <w:t>职责</w:t>
+            </w:r>
+          </w:p>
+        </w:tc>
+      </w:tr>
+      <w:tr>
+        <w:tc>
+          <w:tcPr>
+            <w:tcW w:type="dxa" w:w="3324"/>
+          </w:tcPr>
+          <w:p>
+            <w:r>
+              <w:rPr>
+                <w:b/>
+                <w:sz w:val="17"/>
+              </w:rPr>
+              <w:t>域技能</w:t>
+            </w:r>
+          </w:p>
+        </w:tc>
+        <w:tc>
+          <w:tcPr>
+            <w:tcW w:type="dxa" w:w="3324"/>
+          </w:tcPr>
+          <w:p>
+            <w:r>
+              <w:rPr>
+                <w:rFonts w:ascii="Consolas" w:hAnsi="Consolas"/>
+                <w:sz w:val="17"/>
+              </w:rPr>
+              <w:t>psa-engine</w:t>
+            </w:r>
+          </w:p>
+        </w:tc>
+        <w:tc>
+          <w:tcPr>
+            <w:tcW w:type="dxa" w:w="3324"/>
+          </w:tcPr>
+          <w:p>
+            <w:r>
+              <w:rPr>
+                <w:sz w:val="17"/>
+              </w:rPr>
+              <w:t>定量引擎架构/既定偏离(无补边 ROBDD、精确成功否定)/验证门(benchmark 强制)</w:t>
+            </w:r>
+          </w:p>
+        </w:tc>
+      </w:tr>
+      <w:tr>
+        <w:tc>
+          <w:tcPr>
+            <w:tcW w:type="dxa" w:w="3324"/>
+          </w:tcPr>
+          <w:p>
+            <w:r>
+              <w:rPr>
+                <w:rFonts w:ascii="Consolas" w:hAnsi="Consolas"/>
+                <w:sz w:val="17"/>
+              </w:rPr>
+              <w:t>psa-frontend</w:t>
+            </w:r>
+          </w:p>
+        </w:tc>
+        <w:tc>
+          <w:tcPr>
+            <w:tcW w:type="dxa" w:w="3324"/>
+          </w:tcPr>
+          <w:p>
+            <w:r>
+              <w:rPr>
+                <w:sz w:val="17"/>
+              </w:rPr>
+              <w:t>探索者壳+多项目槽架构、硬性规则(tsc -b、槽钉定)、开发环境陷阱</w:t>
+            </w:r>
+          </w:p>
+        </w:tc>
+        <w:tc>
+          <w:tcPr>
+            <w:tcW w:type="dxa" w:w="3324"/>
+          </w:tcPr>
+          <w:p/>
+        </w:tc>
+      </w:tr>
+      <w:tr>
+        <w:tc>
+          <w:tcPr>
+            <w:tcW w:type="dxa" w:w="3324"/>
+          </w:tcPr>
+          <w:p>
+            <w:r>
+              <w:rPr>
+                <w:rFonts w:ascii="Consolas" w:hAnsi="Consolas"/>
+                <w:sz w:val="17"/>
+              </w:rPr>
+              <w:t>psa-evidence-chain</w:t>
+            </w:r>
+          </w:p>
+        </w:tc>
+        <w:tc>
+          <w:tcPr>
+            <w:tcW w:type="dxa" w:w="3324"/>
+          </w:tcPr>
+          <w:p>
+            <w:r>
+              <w:rPr>
+                <w:sz w:val="17"/>
+              </w:rPr>
+              <w:t>版本库/审计/评审签发/认证/组合总览的九条不变量与已付学费清单</w:t>
+            </w:r>
+          </w:p>
+        </w:tc>
+        <w:tc>
+          <w:tcPr>
+            <w:tcW w:type="dxa" w:w="3324"/>
+          </w:tcPr>
+          <w:p/>
+        </w:tc>
+      </w:tr>
+      <w:tr>
+        <w:tc>
+          <w:tcPr>
+            <w:tcW w:type="dxa" w:w="3324"/>
+          </w:tcPr>
+          <w:p>
+            <w:r>
+              <w:rPr>
+                <w:rFonts w:ascii="Consolas" w:hAnsi="Consolas"/>
+                <w:sz w:val="17"/>
+              </w:rPr>
+              <w:t>bess-tr-model</w:t>
+            </w:r>
+          </w:p>
+        </w:tc>
+        <w:tc>
+          <w:tcPr>
+            <w:tcW w:type="dxa" w:w="3324"/>
+          </w:tcPr>
+          <w:p>
+            <w:r>
+              <w:rPr>
+                <w:sz w:val="17"/>
+              </w:rPr>
+              <w:t>热失控事件序列/屏障框架/后果分级/标准映射(UL 9540A、NFPA 855…)</w:t>
+            </w:r>
+          </w:p>
+        </w:tc>
+        <w:tc>
+          <w:tcPr>
+            <w:tcW w:type="dxa" w:w="3324"/>
+          </w:tcPr>
+          <w:p/>
+        </w:tc>
+      </w:tr>
+      <w:tr>
+        <w:tc>
+          <w:tcPr>
+            <w:tcW w:type="dxa" w:w="3324"/>
+          </w:tcPr>
+          <w:p>
+            <w:r>
+              <w:rPr>
+                <w:rFonts w:ascii="Consolas" w:hAnsi="Consolas"/>
+                <w:sz w:val="17"/>
+              </w:rPr>
+              <w:t>eta-reference-data</w:t>
+            </w:r>
+          </w:p>
+        </w:tc>
+        <w:tc>
+          <w:tcPr>
+            <w:tcW w:type="dxa" w:w="3324"/>
+          </w:tcPr>
+          <w:p>
+            <w:r>
+              <w:rPr>
+                <w:sz w:val="17"/>
+              </w:rPr>
+              <w:t>参考库维护:分级/引文/单位纪律/贝叶斯更新路径</w:t>
+            </w:r>
+          </w:p>
+        </w:tc>
+        <w:tc>
+          <w:tcPr>
+            <w:tcW w:type="dxa" w:w="3324"/>
+          </w:tcPr>
+          <w:p/>
+        </w:tc>
+      </w:tr>
+      <w:tr>
+        <w:tc>
+          <w:tcPr>
+            <w:tcW w:type="dxa" w:w="3324"/>
+          </w:tcPr>
+          <w:p>
+            <w:r>
+              <w:rPr>
+                <w:b/>
+                <w:sz w:val="17"/>
+              </w:rPr>
+              <w:t>流程技能</w:t>
+            </w:r>
+          </w:p>
+        </w:tc>
+        <w:tc>
+          <w:tcPr>
+            <w:tcW w:type="dxa" w:w="3324"/>
+          </w:tcPr>
+          <w:p>
+            <w:r>
+              <w:rPr>
+                <w:rFonts w:ascii="Consolas" w:hAnsi="Consolas"/>
+                <w:sz w:val="17"/>
+              </w:rPr>
+              <w:t>blindspot-pass</w:t>
+            </w:r>
+          </w:p>
+        </w:tc>
+        <w:tc>
+          <w:tcPr>
+            <w:tcW w:type="dxa" w:w="3324"/>
+          </w:tcPr>
+          <w:p>
+            <w:r>
+              <w:rPr>
+                <w:sz w:val="17"/>
+              </w:rPr>
+              <w:t>动工前的未知盲区探查(新领地强制;曾揪出在产量纲 bug)</w:t>
+            </w:r>
+          </w:p>
+        </w:tc>
+      </w:tr>
+      <w:tr>
+        <w:tc>
+          <w:tcPr>
+            <w:tcW w:type="dxa" w:w="3324"/>
+          </w:tcPr>
+          <w:p>
+            <w:r>
+              <w:rPr>
+                <w:rFonts w:ascii="Consolas" w:hAnsi="Consolas"/>
+                <w:sz w:val="17"/>
+              </w:rPr>
+              <w:t>interview-me</w:t>
+            </w:r>
+          </w:p>
+        </w:tc>
+        <w:tc>
+          <w:tcPr>
+            <w:tcW w:type="dxa" w:w="3324"/>
+          </w:tcPr>
+          <w:p>
+            <w:r>
+              <w:rPr>
+                <w:sz w:val="17"/>
+              </w:rPr>
+              <w:t>逐题访谈锁定会改变设计的决策(一次一题)</w:t>
+            </w:r>
+          </w:p>
+        </w:tc>
+        <w:tc>
+          <w:tcPr>
+            <w:tcW w:type="dxa" w:w="3324"/>
+          </w:tcPr>
+          <w:p/>
+        </w:tc>
+      </w:tr>
+      <w:tr>
+        <w:tc>
+          <w:tcPr>
+            <w:tcW w:type="dxa" w:w="3324"/>
+          </w:tcPr>
+          <w:p>
+            <w:r>
+              <w:rPr>
+                <w:rFonts w:ascii="Consolas" w:hAnsi="Consolas"/>
+                <w:sz w:val="17"/>
+              </w:rPr>
+              <w:t>design-directions</w:t>
+            </w:r>
+          </w:p>
+        </w:tc>
+        <w:tc>
+          <w:tcPr>
+            <w:tcW w:type="dxa" w:w="3324"/>
+          </w:tcPr>
+          <w:p>
+            <w:r>
+              <w:rPr>
+                <w:sz w:val="17"/>
+              </w:rPr>
+              <w:t>3–4 个分歧方向 HTML 样机,真实数据,用户挑选(壳/评审 UX 均由此定)</w:t>
+            </w:r>
+          </w:p>
+        </w:tc>
+        <w:tc>
+          <w:tcPr>
+            <w:tcW w:type="dxa" w:w="3324"/>
+          </w:tcPr>
+          <w:p/>
+        </w:tc>
+      </w:tr>
+      <w:tr>
+        <w:tc>
+          <w:tcPr>
+            <w:tcW w:type="dxa" w:w="3324"/>
+          </w:tcPr>
+          <w:p>
+            <w:r>
+              <w:rPr>
+                <w:rFonts w:ascii="Consolas" w:hAnsi="Consolas"/>
+                <w:sz w:val="17"/>
+              </w:rPr>
+              <w:t>reference-hunt</w:t>
+            </w:r>
+          </w:p>
+        </w:tc>
+        <w:tc>
+          <w:tcPr>
+            <w:tcW w:type="dxa" w:w="3324"/>
+          </w:tcPr>
+          <w:p>
+            <w:r>
+              <w:rPr>
+                <w:sz w:val="17"/>
+              </w:rPr>
+              <w:t>复刻既有工具行为前先取证其精确语义(SCRAM 源码/RS 手册/NUREG)</w:t>
+            </w:r>
+          </w:p>
+        </w:tc>
+        <w:tc>
+          <w:tcPr>
+            <w:tcW w:type="dxa" w:w="3324"/>
+          </w:tcPr>
+          <w:p/>
+        </w:tc>
+      </w:tr>
+      <w:tr>
+        <w:tc>
+          <w:tcPr>
+            <w:tcW w:type="dxa" w:w="3324"/>
+          </w:tcPr>
+          <w:p>
+            <w:r>
+              <w:rPr>
+                <w:rFonts w:ascii="Consolas" w:hAnsi="Consolas"/>
+                <w:sz w:val="17"/>
+              </w:rPr>
+              <w:t>plan-feature</w:t>
+            </w:r>
+          </w:p>
+        </w:tc>
+        <w:tc>
+          <w:tcPr>
+            <w:tcW w:type="dxa" w:w="3324"/>
+          </w:tcPr>
+          <w:p>
+            <w:r>
+              <w:rPr>
+                <w:sz w:val="17"/>
+              </w:rPr>
+              <w:t>规格+计划,按"最可能变更"排序,存 docs/superpowers/</w:t>
+            </w:r>
+          </w:p>
+        </w:tc>
+        <w:tc>
+          <w:tcPr>
+            <w:tcW w:type="dxa" w:w="3324"/>
+          </w:tcPr>
+          <w:p/>
+        </w:tc>
+      </w:tr>
+      <w:tr>
+        <w:tc>
+          <w:tcPr>
+            <w:tcW w:type="dxa" w:w="3324"/>
+          </w:tcPr>
+          <w:p>
+            <w:r>
+              <w:rPr>
+                <w:rFonts w:ascii="Consolas" w:hAnsi="Consolas"/>
+                <w:sz w:val="17"/>
+              </w:rPr>
+              <w:t>verify-psa</w:t>
+            </w:r>
+          </w:p>
+        </w:tc>
+        <w:tc>
+          <w:tcPr>
+            <w:tcW w:type="dxa" w:w="3324"/>
+          </w:tcPr>
+          <w:p>
+            <w:r>
+              <w:rPr>
+                <w:sz w:val="17"/>
+              </w:rPr>
+              <w:t>分级验证门 + 对抗审查升级规则 + 夹具真实性(§10.1)</w:t>
+            </w:r>
+          </w:p>
+        </w:tc>
+        <w:tc>
+          <w:tcPr>
+            <w:tcW w:type="dxa" w:w="3324"/>
+          </w:tcPr>
+          <w:p/>
+        </w:tc>
+      </w:tr>
+      <w:tr>
+        <w:tc>
+          <w:tcPr>
+            <w:tcW w:type="dxa" w:w="3324"/>
+          </w:tcPr>
+          <w:p>
+            <w:r>
+              <w:rPr>
+                <w:rFonts w:ascii="Consolas" w:hAnsi="Consolas"/>
+                <w:sz w:val="17"/>
+              </w:rPr>
+              <w:t>change-quiz</w:t>
+            </w:r>
+          </w:p>
+        </w:tc>
+        <w:tc>
+          <w:tcPr>
+            <w:tcW w:type="dxa" w:w="3324"/>
+          </w:tcPr>
+          <w:p>
+            <w:r>
+              <w:rPr>
+                <w:sz w:val="17"/>
+              </w:rPr>
+              <w:t>合并前用户理解关卡(可显式免试,答案卷存档 docs/reviews/)</w:t>
+            </w:r>
+          </w:p>
+        </w:tc>
+        <w:tc>
+          <w:tcPr>
+            <w:tcW w:type="dxa" w:w="3324"/>
+          </w:tcPr>
+          <w:p/>
+        </w:tc>
+      </w:tr>
+      <w:tr>
+        <w:tc>
+          <w:tcPr>
+            <w:tcW w:type="dxa" w:w="3324"/>
+          </w:tcPr>
+          <w:p>
+            <w:r>
+              <w:rPr>
+                <w:rFonts w:ascii="Consolas" w:hAnsi="Consolas"/>
+                <w:sz w:val="17"/>
+              </w:rPr>
+              <w:t>riskspectrum-parity</w:t>
+            </w:r>
+          </w:p>
+        </w:tc>
+        <w:tc>
+          <w:tcPr>
+            <w:tcW w:type="dxa" w:w="3324"/>
+          </w:tcPr>
+          <w:p>
+            <w:r>
+              <w:rPr>
+                <w:sz w:val="17"/>
+              </w:rPr>
+              <w:t>活对标台账:已达/超越(带证据与日期)vs 差距(排序)</w:t>
+            </w:r>
+          </w:p>
+        </w:tc>
+        <w:tc>
+          <w:tcPr>
+            <w:tcW w:type="dxa" w:w="3324"/>
+          </w:tcPr>
+          <w:p/>
+        </w:tc>
+      </w:tr>
+      <w:tr>
+        <w:tc>
+          <w:tcPr>
+            <w:tcW w:type="dxa" w:w="3324"/>
+          </w:tcPr>
+          <w:p>
+            <w:r>
+              <w:rPr>
+                <w:rFonts w:ascii="Consolas" w:hAnsi="Consolas"/>
+                <w:sz w:val="17"/>
+              </w:rPr>
+              <w:t>regulatory-traceability</w:t>
+            </w:r>
+          </w:p>
+        </w:tc>
+        <w:tc>
+          <w:tcPr>
+            <w:tcW w:type="dxa" w:w="3324"/>
+          </w:tcPr>
+          <w:p>
+            <w:r>
+              <w:rPr>
+                <w:sz w:val="17"/>
+              </w:rPr>
+              <w:t>监管面向输出的证据链清单(数字→版本→设置→出处)</w:t>
+            </w:r>
+          </w:p>
+        </w:tc>
+        <w:tc>
+          <w:tcPr>
+            <w:tcW w:type="dxa" w:w="3324"/>
+          </w:tcPr>
+          <w:p/>
+        </w:tc>
+      </w:tr>
+      <w:tr>
+        <w:tc>
+          <w:tcPr>
+            <w:tcW w:type="dxa" w:w="3324"/>
+          </w:tcPr>
+          <w:p>
+            <w:r>
+              <w:rPr>
+                <w:b/>
+                <w:sz w:val="17"/>
+              </w:rPr>
+              <w:t>评审/实现代理</w:t>
+            </w:r>
+          </w:p>
+        </w:tc>
+        <w:tc>
+          <w:tcPr>
+            <w:tcW w:type="dxa" w:w="3324"/>
+          </w:tcPr>
+          <w:p>
+            <w:r>
+              <w:rPr>
+                <w:rFonts w:ascii="Consolas" w:hAnsi="Consolas"/>
+                <w:sz w:val="17"/>
+              </w:rPr>
+              <w:t>engine-reviewer</w:t>
+            </w:r>
+          </w:p>
+        </w:tc>
+        <w:tc>
+          <w:tcPr>
+            <w:tcW w:type="dxa" w:w="3324"/>
+          </w:tcPr>
+          <w:p>
+            <w:r>
+              <w:rPr>
+                <w:sz w:val="17"/>
+              </w:rPr>
+              <w:t>数值对抗评审(psaengine/bess 改动强制;两轮制)</w:t>
+            </w:r>
+          </w:p>
+        </w:tc>
+      </w:tr>
+      <w:tr>
+        <w:tc>
+          <w:tcPr>
+            <w:tcW w:type="dxa" w:w="3324"/>
+          </w:tcPr>
+          <w:p>
+            <w:r>
+              <w:rPr>
+                <w:rFonts w:ascii="Consolas" w:hAnsi="Consolas"/>
+                <w:sz w:val="17"/>
+              </w:rPr>
+              <w:t>domain-reviewer</w:t>
+            </w:r>
+          </w:p>
+        </w:tc>
+        <w:tc>
+          <w:tcPr>
+            <w:tcW w:type="dxa" w:w="3324"/>
+          </w:tcPr>
+          <w:p>
+            <w:r>
+              <w:rPr>
+                <w:sz w:val="17"/>
+              </w:rPr>
+              <w:t>PSA 方法学/数据分级/报告口径评审(聚合声明、AI 产物)</w:t>
+            </w:r>
+          </w:p>
+        </w:tc>
+        <w:tc>
+          <w:tcPr>
+            <w:tcW w:type="dxa" w:w="3324"/>
+          </w:tcPr>
+          <w:p/>
+        </w:tc>
+      </w:tr>
+      <w:tr>
+        <w:tc>
+          <w:tcPr>
+            <w:tcW w:type="dxa" w:w="3324"/>
+          </w:tcPr>
+          <w:p>
+            <w:r>
+              <w:rPr>
+                <w:rFonts w:ascii="Consolas" w:hAnsi="Consolas"/>
+                <w:sz w:val="17"/>
+              </w:rPr>
+              <w:t>frontend-dev</w:t>
+            </w:r>
+          </w:p>
+        </w:tc>
+        <w:tc>
+          <w:tcPr>
+            <w:tcW w:type="dxa" w:w="3324"/>
+          </w:tcPr>
+          <w:p>
+            <w:r>
+              <w:rPr>
+                <w:sz w:val="17"/>
+              </w:rPr>
+              <w:t>按规格执行 UI 的实现代理(Sonnet;禁碰清单/收口门内建)</w:t>
+            </w:r>
+          </w:p>
+        </w:tc>
+        <w:tc>
+          <w:tcPr>
+            <w:tcW w:type="dxa" w:w="3324"/>
+          </w:tcPr>
+          <w:p/>
+        </w:tc>
+      </w:tr>
+    </w:tbl>
+    <w:p>
+      <w:pPr>
+        <w:pStyle w:val="Heading2"/>
+      </w:pPr>
+      <w:r>
+        <w:t>10.3 规格驱动交付流程</w:t>
+      </w:r>
+    </w:p>
+    <w:p>
+      <w:pPr>
+        <w:jc w:val="center"/>
+      </w:pPr>
+      <w:r>
+        <w:drawing>
+          <wp:inline xmlns:a="http://schemas.openxmlformats.org/drawingml/2006/main" xmlns:pic="http://schemas.openxmlformats.org/drawingml/2006/picture">
+            <wp:extent cx="5976000" cy="1290273"/>
+            <wp:docPr id="10" name="Picture 10"/>
+            <wp:cNvGraphicFramePr>
+              <a:graphicFrameLocks noChangeAspect="1"/>
+            </wp:cNvGraphicFramePr>
+            <a:graphic>
+              <a:graphicData uri="http://schemas.openxmlformats.org/drawingml/2006/picture">
+                <pic:pic>
+                  <pic:nvPicPr>
+                    <pic:cNvPr id="0" name="fig-10.png"/>
+                    <pic:cNvPicPr/>
+                  </pic:nvPicPr>
+                  <pic:blipFill>
+                    <a:blip r:embed="rId18"/>
+                    <a:stretch>
+                      <a:fillRect/>
+                    </a:stretch>
+                  </pic:blipFill>
+                  <pic:spPr>
+                    <a:xfrm>
+                      <a:off x="0" y="0"/>
+                      <a:ext cx="5976000" cy="1290273"/>
+                    </a:xfrm>
+                    <a:prstGeom prst="rect"/>
+                  </pic:spPr>
+                </pic:pic>
+              </a:graphicData>
+            </a:graphic>
+          </wp:inline>
+        </w:drawing>
+      </w:r>
+    </w:p>
+    <w:p>
+      <w:pPr>
+        <w:jc w:val="left"/>
+      </w:pPr>
+      <w:r>
+        <w:rPr>
+          <w:b/>
+          <w:color w:val="66788C"/>
+          <w:sz w:val="18"/>
+        </w:rPr>
+        <w:t>图 10</w:t>
+      </w:r>
+      <w:r>
+        <w:rPr>
+          <w:color w:val="66788C"/>
+          <w:sz w:val="18"/>
+        </w:rPr>
+        <w:t xml:space="preserve"> · 每特性交付流水线。产物均入库可查:规格/计划</w:t>
+        <w:br/>
+        <w:t xml:space="preserve">    (</w:t>
+      </w:r>
+      <w:r>
+        <w:rPr>
+          <w:rFonts w:ascii="Consolas" w:hAnsi="Consolas"/>
+          <w:color w:val="66788C"/>
+          <w:sz w:val="18"/>
+        </w:rPr>
+        <w:t>docs/superpowers/specs|plans/</w:t>
+      </w:r>
+      <w:r>
+        <w:rPr>
+          <w:color w:val="66788C"/>
+          <w:sz w:val="18"/>
+        </w:rPr>
+        <w:t>,日期命名)、评审记录(规格内或</w:t>
+        <w:br/>
+        <w:t xml:space="preserve">    </w:t>
+      </w:r>
+      <w:r>
+        <w:rPr>
+          <w:rFonts w:ascii="Consolas" w:hAnsi="Consolas"/>
+          <w:color w:val="66788C"/>
+          <w:sz w:val="18"/>
+        </w:rPr>
+        <w:t>docs/reviews/</w:t>
+      </w:r>
+      <w:r>
+        <w:rPr>
+          <w:color w:val="66788C"/>
+          <w:sz w:val="18"/>
+        </w:rPr>
+        <w:t>)、收口台账(</w:t>
+      </w:r>
+      <w:r>
+        <w:rPr>
+          <w:rFonts w:ascii="Consolas" w:hAnsi="Consolas"/>
+          <w:color w:val="66788C"/>
+          <w:sz w:val="18"/>
+        </w:rPr>
+        <w:t>ROADMAP.md</w:t>
+      </w:r>
+      <w:r>
+        <w:rPr>
+          <w:color w:val="66788C"/>
+          <w:sz w:val="18"/>
+        </w:rPr>
+        <w:t xml:space="preserve"> 逐条带提交哈希)。</w:t>
+        <w:br/>
+        <w:t xml:space="preserve">    quiz 可由用户显式免试,免试与答案卷同样存档——流程留痕本身就是证据链的一部分。</w:t>
+      </w:r>
+    </w:p>
+    <w:p>
+      <w:pPr>
+        <w:pStyle w:val="Heading1"/>
+      </w:pPr>
+      <w:r>
+        <w:t>11 局限与路线图</w:t>
       </w:r>
     </w:p>
     <w:p>
@@ -12533,7 +13608,7 @@
         <w:pStyle w:val="Heading1"/>
       </w:pPr>
       <w:r>
-        <w:t>11 参考文献</w:t>
+        <w:t>12 参考文献</w:t>
       </w:r>
     </w:p>
     <w:p>

</xml_diff>

<commit_message>
docs: Opus batch closeout — backlog cleared, ledger/CLAUDE.md/ROADMAP synced, Word rebuilt
Co-Authored-By: Claude Fable 5 <noreply@anthropic.com>
</commit_message>
<xml_diff>
--- a/docs/BESS-PSA-TD-001-技术文档.docx
+++ b/docs/BESS-PSA-TD-001-技术文档.docx
@@ -9352,24 +9352,41 @@
               <w:rPr>
                 <w:sz w:val="19"/>
               </w:rPr>
-              <w:t>(按需 PFD)绝不静默换算;初因频率为系统级</w:t>
+              <w:t>(按需 PFD)绝不静默换算;初因频率 canonical</w:t>
               <w:br/>
-              <w:t xml:space="preserve">  </w:t>
+              <w:t xml:space="preserve">  口径为</w:t>
+            </w:r>
+            <w:r>
+              <w:rPr>
+                <w:b/>
+                <w:sz w:val="19"/>
+              </w:rPr>
+              <w:t>舱级</w:t>
+            </w:r>
+            <w:r>
+              <w:rPr>
+                <w:sz w:val="19"/>
+              </w:rPr>
+              <w:t>(</w:t>
             </w:r>
             <w:r>
               <w:rPr>
                 <w:rFonts w:ascii="Consolas" w:hAnsi="Consolas"/>
                 <w:sz w:val="19"/>
               </w:rPr>
-              <w:t>/yr</w:t>
+              <w:t>/unit·yr</w:t>
             </w:r>
             <w:r>
               <w:rPr>
                 <w:sz w:val="19"/>
               </w:rPr>
-              <w:t>,「×电芯数折算」只允许出现在推导注记里。库内每条数据 = 值 + 单位 + 分级 + 引文 +</w:t>
+              <w:t>,舱 = 事件树演化单元;裁决</w:t>
               <w:br/>
-              <w:t xml:space="preserve">  (可选)探测维度;5 条初因频率条目全部带推导链。</w:t>
+              <w:t xml:space="preserve">  2026-07-14),站级/系统级数字属项目层换算,「×/÷电芯数折算」只允许显式出现在推导注记里。</w:t>
+              <w:br/>
+              <w:t xml:space="preserve">  库内每条数据 = 值 + 单位 + 分级 + 引文 +</w:t>
+              <w:br/>
+              <w:t xml:space="preserve">  (可选)探测维度;5 条初因频率条目全部带推导链。系统级↔舱级换算必须显式(电芯数维度),电芯派生的舱级值隐含 cells/舱 假设(库锚定 1×10⁴),跨产品体系引用须按实际 cells/舱 重算。</w:t>
             </w:r>
           </w:p>
         </w:tc>

</xml_diff>